<commit_message>
additional fixes/changes as requested
</commit_message>
<xml_diff>
--- a/public/docs/is-2026.docx
+++ b/public/docs/is-2026.docx
@@ -94,7 +94,7 @@
       <w:pPr/>
       <w:r>
         <w:rPr/>
-        <w:t xml:space="preserve">The revised and updated #ImmigrationSyllabus follows a loosely chronological overview of US immigration history, but with thematic emphases on issues like deportation and detention that transcend time periods. As there are many ways of learning immigration history, the topics included here are not intended to be exhaustive. Rather, we have selected readings that directly offer historical context for understanding contemporary immigration politics and have proven useful in our teaching. Each week of the syllabus provides a selection of relevant scholarship, as well as a list of resources that may be useful in a classroom or workshop setting. We prioritized recent scholarship to give a sense of how the field of immigration history is developing, but please see the original </w:t>
+        <w:t xml:space="preserve">The revised and updated #ImmigrationSyllabus follows a loosely chronological overview of US immigration history, but with thematic emphases on issues like deportation and detention that transcend time periods. As there are many ways of learning immigration history, the topics included here are not intended to be exhaustive. Rather, we have selected readings that directly offer historical context for understanding contemporary immigration politics and have proven useful in our teaching.Each week of the syllabus provides a selection of relevant scholarship, as well as a list of resources that may be useful in a classroom or workshop setting. We prioritized recent scholarship to give a sense of how the field of immigration history is developing, but please see the original </w:t>
       </w:r>
       <w:hyperlink w:history="1" r:id="rId12">
         <w:r>
@@ -2679,7 +2679,7 @@
       </w:r>
       <w:r>
         <w:rPr/>
-        <w:t xml:space="preserve">, June 28, 2018 (public-facing article)</w:t>
+        <w:t xml:space="preserve">, June 28, 2018(public-facing article)</w:t>
       </w:r>
     </w:p>
     <w:p>
@@ -8226,7 +8226,7 @@
             <w:color w:val="0000FF" w:themeColor="hyperlink"/>
             <w:u w:val="single"/>
           </w:rPr>
-          <w:t xml:space="preserve">The Other Side of the Water: Immigration and the Promise of Racial Justice</w:t>
+          <w:t xml:space="preserve">The Other Side of the Water:Immigration and the Promise of Racial Justice</w:t>
         </w:r>
       </w:hyperlink>
       <w:r>
@@ -9725,7 +9725,7 @@
       <w:pPr/>
       <w:r>
         <w:rPr/>
-        <w:t xml:space="preserve">United States expansion resulted in shifting and in many ways permeable national borders for generations. As the US increased its efforts to exclude and expel “undesirable” immigrants, border policing took on increased importance. From the creation of the Border Patrol in 1924 to “prevention through deterrence” in the early 1990s and into the 21st century, the US has expanded its efforts to regulate human mobility across national borders. In popular discourse, “the border” has long been shorthand for the Southwest, a product of an imaginary that linked Mexicanness with illegality and the region most linked to their presence as a place in need of policing. But in fact “the border” has historically encompassed all of the nation’s land and water boundaries, as well as other physical spaces that served as entry points into sovereign territory, such as airports. To maintain spatial control the US instituted uneven enforcement strategies at its myriad ports of entry and created legal regimes that codified border crossings as criminally transgressive. Border enforcement has created humanitarian catastrophes as landscapes have been weaponized as tools of exclusion. But borderlands are not solely spaces of state violence and control; they are also vibrant transnational spaces of community and culture.</w:t>
+        <w:t xml:space="preserve">United States expansion resulted in shifting and in many ways permeable national borders for generations. As the US increased its efforts to exclude and expel “undesirable” immigrants,border policing took on increased importance. From the creation of the Border Patrol in 1924 to “prevention through deterrence” in the early 1990s and into the 21st century, the US has expanded its efforts to regulate human mobility across national borders. In popular discourse, “the border” has long been shorthand for the Southwest, a product of an imaginary that linked Mexicanness with illegality and the region most linked to their presence as a place in need of policing. But in fact “the border” has historically encompassed all of the nation’s land and water boundaries, as well as other physical spaces that served as entry points into sovereign territory, such as airports. To maintain spatial control the US instituted uneven enforcement strategies at its myriad ports of entry and created legal regimes that codified border crossings as criminally transgressive. Border enforcement has created humanitarian catastrophes as landscapes have been weaponized as tools of exclusion. But borderlands are not solely spaces of state violence and control; they are also vibrant transnational spaces of community and culture.</w:t>
       </w:r>
     </w:p>
     <w:p>
@@ -11828,7 +11828,7 @@
       </w:pPr>
       <w:r>
         <w:rPr/>
-        <w:t xml:space="preserve">Max Friedman, “</w:t>
+        <w:t xml:space="preserve">Max Friedman,“</w:t>
       </w:r>
       <w:hyperlink w:history="1" r:id="rId193">
         <w:r>
@@ -12067,7 +12067,7 @@
       <w:pPr/>
       <w:r>
         <w:rPr/>
-        <w:t xml:space="preserve">Consultants included: Maddalena Marinari, Professor of History and the Dorothy Peterson, Mildred Peterson Hanson, and Arthur Jennings Hanson Endowed Professor of Liberal Studies, Gustavus Adolphus College; Yael Schacher, Director for Americas and Europe, Refugees International</w:t>
+        <w:t xml:space="preserve">Consultants included: Maddalena Marinari, Professor of History and the Dorothy Peterson, Mildred Peterson Hanson, and Arthur Jennings Hanson Endowed Professor of Liberal Studies, Gustavus Adolphus College; Yael Schacher, Director for Americas and Europe, Refugees International.</w:t>
       </w:r>
     </w:p>
     <w:p>
@@ -12084,7 +12084,7 @@
       <w:pPr/>
       <w:r>
         <w:rPr/>
-        <w:t xml:space="preserve">The original project was led by </w:t>
+        <w:t xml:space="preserve">The original #ImmigrationSyllabus was led by </w:t>
       </w:r>
       <w:hyperlink w:history="1" r:id="rId201">
         <w:r>
@@ -12097,14 +12097,14 @@
       </w:hyperlink>
       <w:r>
         <w:rPr/>
-        <w:t xml:space="preserve">, past Director of the Immigration History Research Center and currently Bae Family Professor of History, Radcliffe Alumnae Professor, and the Carl and Lily Pforzheimer Foundation Director Schlesinger Library on the History of Women in America.</w:t>
+        <w:t xml:space="preserve">, past Director of the Immigration History Research Center and currently Bae Family Professor of History, Radcliffe Alumnae Professor, and the Carl and Lily Pforzheimer Foundation Director Schlesinger Library on the History of Women in America at Harvard University.</w:t>
       </w:r>
     </w:p>
     <w:p>
       <w:pPr/>
       <w:r>
         <w:rPr/>
-        <w:t xml:space="preserve">Organizers of the original #ImmigrationSyllabus included: Erika Lee, María Cristina García, Adam Goodman, Madeline Hsu, Julian Lim, Maddalena Marinari, and Evan Taparata.</w:t>
+        <w:t xml:space="preserve">Contributors to the original #ImmigrationSyllabus included: Erika Lee, María Cristina García, Adam Goodman, Madeline Hsu, Julian Lim, Maddalena Marinari, and Evan Taparata.</w:t>
       </w:r>
     </w:p>
     <w:p>
@@ -12112,13 +12112,6 @@
       <w:r>
         <w:rPr/>
         <w:t xml:space="preserve">Consultants for the original #ImmigrationSyllabus included: Katherine Benton-Cohen, Charlotte Brooks, John J. Bukowczyk, Donna Gabaccia, Libby Garland, David Gerber, Torrie Hester, Ely M. Janis, Anna D. Jaroszynska-Kirchmann, Kevin Kenny, Alan Kraut, Grainne McEvoy, Lucy Salyer, Jordan Stanger-Ross, and Elliott Young.</w:t>
-      </w:r>
-    </w:p>
-    <w:p>
-      <w:pPr/>
-      <w:r>
-        <w:rPr/>
-        <w:t xml:space="preserve">Contributors include: María Cristina García, Howard A. Newman Professor of American Studies at Cornell University and President of the Immigration and Ethnic History Society (IEHS); Adam Goodman, Assistant Professor of History &amp; Latin American and Latino Studies, University of Illinois at Chicago; Madeline Hsu, Professor of History, The University of Texas at Austin; Julian Lim, Assistant Professor of History, Arizona State University; Maddalena Marinari, Assistant Professor of History, Gustavus Adolphus College; and Evan Taparata, PhD Candidate in History, University of Minnesota.</w:t>
       </w:r>
     </w:p>
     <w:p>

</xml_diff>